<commit_message>
Surface collaboration evidence and selected projects
</commit_message>
<xml_diff>
--- a/downloads/learning/kyle-hobson-learning-resume.docx
+++ b/downloads/learning/kyle-hobson-learning-resume.docx
@@ -15,7 +15,7 @@
         <w:pStyle w:val="Subtitle"/>
       </w:pPr>
       <w:r>
-        <w:t>Instructional Design | Workshop Facilitation | AI Literacy</w:t>
+        <w:t>Instructional Design · Workshop Facilitation · AI Literacy</w:t>
       </w:r>
     </w:p>
     <w:p>
@@ -37,7 +37,7 @@
     </w:p>
     <w:p>
       <w:pPr>
-        <w:spacing w:after="40"/>
+        <w:spacing w:after="40" w:line="260" w:lineRule="exact"/>
       </w:pPr>
       <w:hyperlink r:id="rId11">
         <w:r>
@@ -48,6 +48,18 @@
           <w:t>linkedin.com/in/jonathankylehobson</w:t>
         </w:r>
       </w:hyperlink>
+      <w:r>
+        <w:t xml:space="preserve">  |  </w:t>
+      </w:r>
+      <w:hyperlink r:id="rId12">
+        <w:r>
+          <w:rPr>
+            <w:color w:val="244D3C"/>
+            <w:u w:val="single"/>
+          </w:rPr>
+          <w:t>github.com/JonathanKHobson</w:t>
+        </w:r>
+      </w:hyperlink>
     </w:p>
     <w:p>
       <w:pPr>
@@ -56,7 +68,7 @@
       <w:r>
         <w:t xml:space="preserve">Portfolio: </w:t>
       </w:r>
-      <w:hyperlink r:id="rId12">
+      <w:hyperlink r:id="rId13">
         <w:r>
           <w:rPr>
             <w:color w:val="244D3C"/>
@@ -65,6 +77,20 @@
           <w:t>jonathankhobson.github.io/portfolio/learning</w:t>
         </w:r>
       </w:hyperlink>
+    </w:p>
+    <w:p>
+      <w:pPr>
+        <w:spacing w:after="60"/>
+      </w:pPr>
+      <w:r>
+        <w:rPr>
+          <w:b/>
+        </w:rPr>
+        <w:t xml:space="preserve">Currently: </w:t>
+      </w:r>
+      <w:r>
+        <w:t>UX Designer &amp; Researcher (Contract), FactorLab · Oct 2025–Present</w:t>
+      </w:r>
     </w:p>
     <w:p>
       <w:pPr>
@@ -89,7 +115,7 @@
     </w:p>
     <w:p>
       <w:r>
-        <w:t>Learning objectives | Guided practice | Assessment revision | Workshop design | Facilitation | AI literacy | Video instruction | User research | Figma | Google Workspace | Adobe Premiere Pro</w:t>
+        <w:t>Learning objectives · Guided practice · Assessment revision · Workshop design · Facilitation · AI literacy · Video instruction · User research · Figma · Google Workspace · Adobe Premiere Pro</w:t>
       </w:r>
     </w:p>
     <w:p>
@@ -151,7 +177,7 @@
       <w:pPr>
         <w:spacing w:after="40"/>
       </w:pPr>
-      <w:hyperlink r:id="rId13">
+      <w:hyperlink r:id="rId14">
         <w:r>
           <w:rPr>
             <w:color w:val="244D3C"/>
@@ -181,7 +207,7 @@
         <w:t>Instructional Designer</w:t>
       </w:r>
       <w:r>
-        <w:t xml:space="preserve">  |  Apr 2022-Oct 2024</w:t>
+        <w:t xml:space="preserve">  |  Apr 2022–Oct 2024</w:t>
       </w:r>
     </w:p>
     <w:p>
@@ -212,7 +238,7 @@
         <w:t>AI Analyst</w:t>
       </w:r>
       <w:r>
-        <w:t xml:space="preserve">  |  Feb 2024-Oct 2024</w:t>
+        <w:t xml:space="preserve">  |  Feb 2024–Oct 2024</w:t>
       </w:r>
     </w:p>
     <w:p>
@@ -256,7 +282,7 @@
         <w:rPr>
           <w:color w:val="58645D"/>
         </w:rPr>
-        <w:t>Learning Design &amp; Facilitation | Experience continued</w:t>
+        <w:t>Instructional Design · Workshop Facilitation · AI Literacy · Experience continued</w:t>
       </w:r>
     </w:p>
     <w:p>
@@ -287,7 +313,7 @@
         <w:t>UX Research Consultant</w:t>
       </w:r>
       <w:r>
-        <w:t xml:space="preserve">  |  Jun 2023-Present</w:t>
+        <w:t xml:space="preserve">  |  Jun 2023–Present</w:t>
       </w:r>
     </w:p>
     <w:p>
@@ -342,7 +368,7 @@
         <w:t>UX Designer &amp; Researcher (Contract)</w:t>
       </w:r>
       <w:r>
-        <w:t xml:space="preserve">  |  Oct 2025-Present</w:t>
+        <w:t xml:space="preserve">  |  Oct 2025–Present</w:t>
       </w:r>
     </w:p>
     <w:p>
@@ -381,7 +407,7 @@
         <w:t>Volunteer</w:t>
       </w:r>
       <w:r>
-        <w:t xml:space="preserve">  |  Sep 2025-Present</w:t>
+        <w:t xml:space="preserve">  |  Sep 2025–Present</w:t>
       </w:r>
     </w:p>
     <w:p>
@@ -412,7 +438,7 @@
         <w:t>Lead UX Researcher</w:t>
       </w:r>
       <w:r>
-        <w:t xml:space="preserve">  |  2023-2025</w:t>
+        <w:t xml:space="preserve">  |  2023–2025</w:t>
       </w:r>
     </w:p>
     <w:p>
@@ -442,7 +468,7 @@
         <w:t>MS User Experience (UX Research)</w:t>
       </w:r>
       <w:r>
-        <w:t xml:space="preserve"> | Arizona State University | 2024</w:t>
+        <w:t xml:space="preserve"> · Arizona State University · 2024</w:t>
       </w:r>
     </w:p>
     <w:p>
@@ -456,7 +482,7 @@
         <w:t>BS Technical Communication (UX)</w:t>
       </w:r>
       <w:r>
-        <w:t xml:space="preserve"> | Arizona State University | 2023</w:t>
+        <w:t xml:space="preserve"> · Arizona State University · 2023</w:t>
       </w:r>
     </w:p>
     <w:p>
@@ -470,7 +496,7 @@
         <w:t>BS Electronic Media</w:t>
       </w:r>
       <w:r>
-        <w:t xml:space="preserve"> | Northern Arizona University | 2014</w:t>
+        <w:t xml:space="preserve"> · Northern Arizona University · 2014</w:t>
       </w:r>
     </w:p>
     <w:sectPr>

</xml_diff>